<commit_message>
refactor(project): remove weather features and refresh evidence
</commit_message>
<xml_diff>
--- a/output/documents/BDA501_Final_Project_QA_QC_Review.docx
+++ b/output/documents/BDA501_Final_Project_QA_QC_Review.docx
@@ -1,6 +1,6 @@
 
 <file path=word/document.xml><?xml version="1.0" encoding="utf-8"?>
-<w:document xmlns:wpc="http://schemas.microsoft.com/office/word/2010/wordprocessingCanvas" xmlns:mo="http://schemas.microsoft.com/office/mac/office/2008/main" xmlns:mc="http://schemas.openxmlformats.org/markup-compatibility/2006" xmlns:mv="urn:schemas-microsoft-com:mac:vml" xmlns:o="urn:schemas-microsoft-com:office:office" xmlns:r="http://schemas.openxmlformats.org/officeDocument/2006/relationships" xmlns:m="http://schemas.openxmlformats.org/officeDocument/2006/math" xmlns:v="urn:schemas-microsoft-com:vml" xmlns:wp14="http://schemas.microsoft.com/office/word/2010/wordprocessingDrawing" xmlns:wp="http://schemas.openxmlformats.org/drawingml/2006/wordprocessingDrawing" xmlns:w10="urn:schemas-microsoft-com:office:word" xmlns:w="http://schemas.openxmlformats.org/wordprocessingml/2006/main" xmlns:w14="http://schemas.microsoft.com/office/word/2010/wordml" xmlns:wpg="http://schemas.microsoft.com/office/word/2010/wordprocessingGroup" xmlns:wpi="http://schemas.microsoft.com/office/word/2010/wordprocessingInk" xmlns:wne="http://schemas.microsoft.com/office/word/2006/wordml" xmlns:wps="http://schemas.microsoft.com/office/word/2010/wordprocessingShape" mc:Ignorable="w14 wp14">
+<w:document xmlns:mc="http://schemas.openxmlformats.org/markup-compatibility/2006" xmlns:w="http://schemas.openxmlformats.org/wordprocessingml/2006/main" mc:Ignorable="w14 wp14">
   <w:body>
     <w:p>
       <w:pPr>
@@ -1021,7 +1021,7 @@
                 <w:rFonts w:ascii="Times New Roman" w:hAnsi="Times New Roman"/>
                 <w:sz w:val="17"/>
               </w:rPr>
-              <w:t>GBTRegressor relative score 0–100; temporal holdout. MAE 7,366, RMSE 11,044, R² 0,658, Precision 88,39%, Recall 30,88% at score ≥ 50. Does not predict trip count; recall indicates missed hotspots.</w:t>
+              <w:t xml:space="preserve">GBTRegressor relative score 0–100; temporal holdout. MAE 7,348, RMSE 11,066, R² 0,655, Precision 88,03%, Recall 30,79% at score ≥ 50. Does not predict trip count; recall indicates missed hotspots.</w:t>
             </w:r>
           </w:p>
         </w:tc>

</xml_diff>